<commit_message>
add component 2 doc
</commit_message>
<xml_diff>
--- a/Component 1 - Concept Proposal.docx
+++ b/Component 1 - Concept Proposal.docx
@@ -151,7 +151,47 @@
           <w:sz w:val="40"/>
           <w:szCs w:val="40"/>
         </w:rPr>
-        <w:t>- 01</w:t>
+        <w:t>–</w:t>
+      </w:r>
+      <w:r>
+        <w:rPr>
+          <w:rFonts w:ascii="Times New Roman" w:hAnsi="Times New Roman" w:cs="Times New Roman"/>
+          <w:sz w:val="40"/>
+          <w:szCs w:val="40"/>
+        </w:rPr>
+        <w:t xml:space="preserve"> 01</w:t>
+      </w:r>
+    </w:p>
+    <w:p>
+      <w:pPr>
+        <w:jc w:val="center"/>
+        <w:rPr>
+          <w:rFonts w:ascii="Times New Roman" w:hAnsi="Times New Roman" w:cs="Times New Roman"/>
+          <w:sz w:val="40"/>
+          <w:szCs w:val="40"/>
+        </w:rPr>
+      </w:pPr>
+    </w:p>
+    <w:p>
+      <w:pPr>
+        <w:jc w:val="center"/>
+        <w:rPr>
+          <w:rFonts w:ascii="Times New Roman" w:hAnsi="Times New Roman" w:cs="Times New Roman"/>
+          <w:b/>
+          <w:bCs/>
+          <w:sz w:val="40"/>
+          <w:szCs w:val="40"/>
+        </w:rPr>
+      </w:pPr>
+      <w:r>
+        <w:rPr>
+          <w:rFonts w:ascii="Times New Roman" w:hAnsi="Times New Roman" w:cs="Times New Roman"/>
+          <w:b/>
+          <w:bCs/>
+          <w:sz w:val="40"/>
+          <w:szCs w:val="40"/>
+        </w:rPr>
+        <w:t>Concept Proposal</w:t>
       </w:r>
     </w:p>
     <w:p>
@@ -183,34 +223,6 @@
         </w:rPr>
         <w:t>SE4051 – Trends in Digital Media</w:t>
       </w:r>
-    </w:p>
-    <w:p>
-      <w:pPr>
-        <w:rPr>
-          <w:rFonts w:ascii="Times New Roman" w:hAnsi="Times New Roman" w:cs="Times New Roman"/>
-        </w:rPr>
-      </w:pPr>
-    </w:p>
-    <w:p>
-      <w:pPr>
-        <w:rPr>
-          <w:rFonts w:ascii="Times New Roman" w:hAnsi="Times New Roman" w:cs="Times New Roman"/>
-        </w:rPr>
-      </w:pPr>
-    </w:p>
-    <w:p>
-      <w:pPr>
-        <w:rPr>
-          <w:rFonts w:ascii="Times New Roman" w:hAnsi="Times New Roman" w:cs="Times New Roman"/>
-        </w:rPr>
-      </w:pPr>
-    </w:p>
-    <w:p>
-      <w:pPr>
-        <w:rPr>
-          <w:rFonts w:ascii="Times New Roman" w:hAnsi="Times New Roman" w:cs="Times New Roman"/>
-        </w:rPr>
-      </w:pPr>
     </w:p>
     <w:p>
       <w:pPr>
@@ -343,8 +355,17 @@
                 <w:rFonts w:ascii="Times New Roman" w:hAnsi="Times New Roman" w:cs="Times New Roman"/>
                 <w:kern w:val="0"/>
               </w:rPr>
-              <w:t>Hearth H.M.H.S</w:t>
-            </w:r>
+              <w:t>Hearth H.M.</w:t>
+            </w:r>
+            <w:proofErr w:type="gramStart"/>
+            <w:r>
+              <w:rPr>
+                <w:rFonts w:ascii="Times New Roman" w:hAnsi="Times New Roman" w:cs="Times New Roman"/>
+                <w:kern w:val="0"/>
+              </w:rPr>
+              <w:t>H.S</w:t>
+            </w:r>
+            <w:proofErr w:type="gramEnd"/>
           </w:p>
         </w:tc>
       </w:tr>
@@ -378,11 +399,11 @@
         <w:br/>
       </w:r>
     </w:p>
-    <w:bookmarkStart w:id="0" w:name="_Toc227346482" w:displacedByCustomXml="next"/>
+    <w:bookmarkStart w:id="0" w:name="_Toc227347421" w:displacedByCustomXml="next"/>
     <w:sdt>
       <w:sdtPr>
         <w:rPr>
-          <w:rFonts w:eastAsia="Aptos" w:cs="Times New Roman"/>
+          <w:rFonts w:ascii="Aptos" w:eastAsia="Aptos" w:hAnsi="Aptos" w:cs="Times New Roman"/>
           <w:b w:val="0"/>
           <w:color w:val="auto"/>
           <w:sz w:val="22"/>
@@ -455,7 +476,7 @@
             </w:rPr>
             <w:fldChar w:fldCharType="separate"/>
           </w:r>
-          <w:hyperlink w:anchor="_Toc227346482" w:history="1">
+          <w:hyperlink w:anchor="_Toc227347421" w:history="1">
             <w:r>
               <w:rPr>
                 <w:rStyle w:val="Hyperlink"/>
@@ -486,7 +507,7 @@
                 <w:noProof/>
                 <w:webHidden/>
               </w:rPr>
-              <w:instrText xml:space="preserve"> PAGEREF _Toc227346482 \h </w:instrText>
+              <w:instrText xml:space="preserve"> PAGEREF _Toc227347421 \h </w:instrText>
             </w:r>
             <w:r>
               <w:rPr>
@@ -534,7 +555,7 @@
               <w:lang w:bidi="ar-SA"/>
             </w:rPr>
           </w:pPr>
-          <w:hyperlink w:anchor="_Toc227346483" w:history="1">
+          <w:hyperlink w:anchor="_Toc227347422" w:history="1">
             <w:r>
               <w:rPr>
                 <w:rStyle w:val="Hyperlink"/>
@@ -565,7 +586,7 @@
                 <w:noProof/>
                 <w:webHidden/>
               </w:rPr>
-              <w:instrText xml:space="preserve"> PAGEREF _Toc227346483 \h </w:instrText>
+              <w:instrText xml:space="preserve"> PAGEREF _Toc227347422 \h </w:instrText>
             </w:r>
             <w:r>
               <w:rPr>
@@ -613,7 +634,7 @@
               <w:lang w:bidi="ar-SA"/>
             </w:rPr>
           </w:pPr>
-          <w:hyperlink w:anchor="_Toc227346484" w:history="1">
+          <w:hyperlink w:anchor="_Toc227347423" w:history="1">
             <w:r>
               <w:rPr>
                 <w:rStyle w:val="Hyperlink"/>
@@ -644,7 +665,7 @@
                 <w:noProof/>
                 <w:webHidden/>
               </w:rPr>
-              <w:instrText xml:space="preserve"> PAGEREF _Toc227346484 \h </w:instrText>
+              <w:instrText xml:space="preserve"> PAGEREF _Toc227347423 \h </w:instrText>
             </w:r>
             <w:r>
               <w:rPr>
@@ -692,7 +713,7 @@
               <w:lang w:bidi="ar-SA"/>
             </w:rPr>
           </w:pPr>
-          <w:hyperlink w:anchor="_Toc227346485" w:history="1">
+          <w:hyperlink w:anchor="_Toc227347424" w:history="1">
             <w:r>
               <w:rPr>
                 <w:rStyle w:val="Hyperlink"/>
@@ -723,7 +744,7 @@
                 <w:noProof/>
                 <w:webHidden/>
               </w:rPr>
-              <w:instrText xml:space="preserve"> PAGEREF _Toc227346485 \h </w:instrText>
+              <w:instrText xml:space="preserve"> PAGEREF _Toc227347424 \h </w:instrText>
             </w:r>
             <w:r>
               <w:rPr>
@@ -771,7 +792,7 @@
               <w:lang w:bidi="ar-SA"/>
             </w:rPr>
           </w:pPr>
-          <w:hyperlink w:anchor="_Toc227346486" w:history="1">
+          <w:hyperlink w:anchor="_Toc227347425" w:history="1">
             <w:r>
               <w:rPr>
                 <w:rStyle w:val="Hyperlink"/>
@@ -802,7 +823,7 @@
                 <w:noProof/>
                 <w:webHidden/>
               </w:rPr>
-              <w:instrText xml:space="preserve"> PAGEREF _Toc227346486 \h </w:instrText>
+              <w:instrText xml:space="preserve"> PAGEREF _Toc227347425 \h </w:instrText>
             </w:r>
             <w:r>
               <w:rPr>
@@ -850,7 +871,7 @@
               <w:lang w:bidi="ar-SA"/>
             </w:rPr>
           </w:pPr>
-          <w:hyperlink w:anchor="_Toc227346487" w:history="1">
+          <w:hyperlink w:anchor="_Toc227347426" w:history="1">
             <w:r>
               <w:rPr>
                 <w:rStyle w:val="Hyperlink"/>
@@ -881,7 +902,7 @@
                 <w:noProof/>
                 <w:webHidden/>
               </w:rPr>
-              <w:instrText xml:space="preserve"> PAGEREF _Toc227346487 \h </w:instrText>
+              <w:instrText xml:space="preserve"> PAGEREF _Toc227347426 \h </w:instrText>
             </w:r>
             <w:r>
               <w:rPr>
@@ -929,7 +950,7 @@
               <w:lang w:bidi="ar-SA"/>
             </w:rPr>
           </w:pPr>
-          <w:hyperlink w:anchor="_Toc227346488" w:history="1">
+          <w:hyperlink w:anchor="_Toc227347427" w:history="1">
             <w:r>
               <w:rPr>
                 <w:rStyle w:val="Hyperlink"/>
@@ -960,7 +981,7 @@
                 <w:noProof/>
                 <w:webHidden/>
               </w:rPr>
-              <w:instrText xml:space="preserve"> PAGEREF _Toc227346488 \h </w:instrText>
+              <w:instrText xml:space="preserve"> PAGEREF _Toc227347427 \h </w:instrText>
             </w:r>
             <w:r>
               <w:rPr>
@@ -1158,7 +1179,7 @@
           <w:rFonts w:cs="Times New Roman"/>
         </w:rPr>
       </w:pPr>
-      <w:bookmarkStart w:id="1" w:name="_Toc227346483"/>
+      <w:bookmarkStart w:id="1" w:name="_Toc227347422"/>
       <w:r>
         <w:rPr>
           <w:rFonts w:cs="Times New Roman"/>
@@ -1369,7 +1390,7 @@
           <w:rFonts w:cs="Times New Roman"/>
         </w:rPr>
       </w:pPr>
-      <w:bookmarkStart w:id="2" w:name="_Toc227346484"/>
+      <w:bookmarkStart w:id="2" w:name="_Toc227347423"/>
       <w:r>
         <w:rPr>
           <w:rFonts w:cs="Times New Roman"/>
@@ -1553,7 +1574,7 @@
           <w:rFonts w:cs="Times New Roman"/>
         </w:rPr>
       </w:pPr>
-      <w:bookmarkStart w:id="3" w:name="_Toc227346485"/>
+      <w:bookmarkStart w:id="3" w:name="_Toc227347424"/>
       <w:r>
         <w:rPr>
           <w:rFonts w:cs="Times New Roman"/>
@@ -1751,7 +1772,7 @@
           <w:rFonts w:cs="Times New Roman"/>
         </w:rPr>
       </w:pPr>
-      <w:bookmarkStart w:id="4" w:name="_Toc227346486"/>
+      <w:bookmarkStart w:id="4" w:name="_Toc227347425"/>
       <w:r>
         <w:rPr>
           <w:rFonts w:cs="Times New Roman"/>
@@ -1941,7 +1962,7 @@
           <w:rFonts w:cs="Times New Roman"/>
         </w:rPr>
       </w:pPr>
-      <w:bookmarkStart w:id="5" w:name="_Toc227346487"/>
+      <w:bookmarkStart w:id="5" w:name="_Toc227347426"/>
       <w:r>
         <w:rPr>
           <w:rFonts w:cs="Times New Roman"/>
@@ -2125,7 +2146,7 @@
           <w:rFonts w:cs="Times New Roman"/>
         </w:rPr>
       </w:pPr>
-      <w:bookmarkStart w:id="6" w:name="_Toc227346488"/>
+      <w:bookmarkStart w:id="6" w:name="_Toc227347427"/>
       <w:r>
         <w:rPr>
           <w:rFonts w:cs="Times New Roman"/>
@@ -3218,6 +3239,7 @@
   <w:style w:type="character" w:default="1" w:styleId="DefaultParagraphFont">
     <w:name w:val="Default Paragraph Font"/>
     <w:uiPriority w:val="1"/>
+    <w:semiHidden/>
     <w:unhideWhenUsed/>
   </w:style>
   <w:style w:type="table" w:default="1" w:styleId="TableNormal">

</xml_diff>